<commit_message>
docs: inclui CT16 e atualiza contagem de testes para 18
</commit_message>
<xml_diff>
--- a/relatorio.docx
+++ b/relatorio.docx
@@ -3449,6 +3449,89 @@
           </w:p>
         </w:tc>
       </w:tr>
+      <w:tr>
+        <w:tc>
+          <w:tcPr/>
+          <w:p>
+            <w:pPr>
+              <w:pStyle w:val="Compact"/>
+            </w:pPr>
+            <w:r>
+              <w:t xml:space="preserve">CT16</w:t>
+            </w:r>
+          </w:p>
+        </w:tc>
+        <w:tc>
+          <w:tcPr/>
+          <w:p>
+            <w:pPr>
+              <w:pStyle w:val="Compact"/>
+            </w:pPr>
+            <w:r>
+              <w:t xml:space="preserve">“ana”</w:t>
+            </w:r>
+            <w:r>
+              <w:t xml:space="preserve"> </w:t>
+            </w:r>
+            <w:r>
+              <w:t xml:space="preserve">com multa pendente</w:t>
+            </w:r>
+          </w:p>
+        </w:tc>
+        <w:tc>
+          <w:tcPr/>
+          <w:p>
+            <w:pPr>
+              <w:pStyle w:val="Compact"/>
+            </w:pPr>
+            <w:r>
+              <w:t xml:space="preserve">“bia”</w:t>
+            </w:r>
+            <w:r>
+              <w:t xml:space="preserve"> </w:t>
+            </w:r>
+            <w:r>
+              <w:t xml:space="preserve">(sem multa) empresta L2</w:t>
+            </w:r>
+          </w:p>
+        </w:tc>
+        <w:tc>
+          <w:tcPr/>
+          <w:p>
+            <w:pPr>
+              <w:pStyle w:val="Compact"/>
+            </w:pPr>
+            <w:r>
+              <w:t xml:space="preserve">“bia”</w:t>
+            </w:r>
+            <w:r>
+              <w:t xml:space="preserve">, L2</w:t>
+            </w:r>
+          </w:p>
+        </w:tc>
+        <w:tc>
+          <w:tcPr/>
+          <w:p>
+            <w:pPr>
+              <w:pStyle w:val="Compact"/>
+            </w:pPr>
+            <w:r>
+              <w:t xml:space="preserve">Empréstimo permitido (a multa é por usuário)</w:t>
+            </w:r>
+          </w:p>
+        </w:tc>
+        <w:tc>
+          <w:tcPr/>
+          <w:p>
+            <w:pPr>
+              <w:pStyle w:val="Compact"/>
+            </w:pPr>
+            <w:r>
+              <w:t xml:space="preserve">Média</w:t>
+            </w:r>
+          </w:p>
+        </w:tc>
+      </w:tr>
     </w:tbl>
     <w:p>
       <w:pPr>
@@ -3704,6 +3787,15 @@
           <w:rStyle w:val="VerbatimChar"/>
         </w:rPr>
         <w:t xml:space="preserve">d6e7ccf refactor: separa validacao do emprestimo em metodo proprio</w:t>
+      </w:r>
+      <w:r>
+        <w:br/>
+      </w:r>
+      <w:r>
+        <w:rPr>
+          <w:rStyle w:val="VerbatimChar"/>
+        </w:rPr>
+        <w:t xml:space="preserve">c34d82a test: multa de um usuario nao bloqueia outro</w:t>
       </w:r>
     </w:p>
     <w:tbl>
@@ -4203,6 +4295,29 @@
         <w:t xml:space="preserve">existia desde o ciclo 1. Ele entrou junto para documentar as fronteiras.</w:t>
       </w:r>
     </w:p>
+    <w:p>
+      <w:pPr>
+        <w:pStyle w:val="BodyText"/>
+      </w:pPr>
+      <w:r>
+        <w:t xml:space="preserve">Depois do ciclo 4, foi acrescentado o teste</w:t>
+      </w:r>
+      <w:r>
+        <w:t xml:space="preserve"> </w:t>
+      </w:r>
+      <w:r>
+        <w:rPr>
+          <w:rStyle w:val="VerbatimChar"/>
+        </w:rPr>
+        <w:t xml:space="preserve">test_multa_de_um_usuario_nao_bloqueia_outro</w:t>
+      </w:r>
+      <w:r>
+        <w:t xml:space="preserve"> </w:t>
+      </w:r>
+      <w:r>
+        <w:t xml:space="preserve">(CT16), que já nasceu passando: ele cobre uma lacuna, garantindo que a multa de um usuário não bloqueia outro.</w:t>
+      </w:r>
+    </w:p>
     <w:bookmarkEnd w:id="18"/>
     <w:bookmarkStart w:id="19" w:name="testes-automatizados"/>
     <w:p>
@@ -4228,13 +4343,13 @@
           <w:b/>
           <w:bCs/>
         </w:rPr>
-        <w:t xml:space="preserve">17 testes unitários</w:t>
-      </w:r>
-      <w:r>
-        <w:t xml:space="preserve"> </w:t>
-      </w:r>
-      <w:r>
-        <w:t xml:space="preserve">(12 funções, sendo uma parametrizada com 6 valores), cobrindo as regras RN1–RN6. Recursos exigidos:</w:t>
+        <w:t xml:space="preserve">18 testes unitários</w:t>
+      </w:r>
+      <w:r>
+        <w:t xml:space="preserve"> </w:t>
+      </w:r>
+      <w:r>
+        <w:t xml:space="preserve">(13 funções, sendo uma parametrizada com 6 valores), cobrindo as regras RN1–RN6. Recursos exigidos:</w:t>
       </w:r>
     </w:p>
     <w:p>
@@ -4482,7 +4597,7 @@
           <w:b/>
           <w:bCs/>
         </w:rPr>
-        <w:t xml:space="preserve">17 aprovados, 0 reprovados, 0 bloqueados</w:t>
+        <w:t xml:space="preserve">18 aprovados, 0 reprovados, 0 bloqueados</w:t>
       </w:r>
       <w:r>
         <w:t xml:space="preserve">.</w:t>
@@ -4746,6 +4861,44 @@
               <w:rPr>
                 <w:rStyle w:val="VerbatimChar"/>
               </w:rPr>
+              <w:t xml:space="preserve">test_multa_de_um_usuario_nao_bloqueia_outro</w:t>
+            </w:r>
+          </w:p>
+        </w:tc>
+        <w:tc>
+          <w:tcPr/>
+          <w:p>
+            <w:pPr>
+              <w:pStyle w:val="Compact"/>
+            </w:pPr>
+            <w:r>
+              <w:t xml:space="preserve">CT16</w:t>
+            </w:r>
+          </w:p>
+        </w:tc>
+        <w:tc>
+          <w:tcPr/>
+          <w:p>
+            <w:pPr>
+              <w:pStyle w:val="Compact"/>
+            </w:pPr>
+            <w:r>
+              <w:t xml:space="preserve">Aprovado</w:t>
+            </w:r>
+          </w:p>
+        </w:tc>
+      </w:tr>
+      <w:tr>
+        <w:tc>
+          <w:tcPr/>
+          <w:p>
+            <w:pPr>
+              <w:pStyle w:val="Compact"/>
+            </w:pPr>
+            <w:r>
+              <w:rPr>
+                <w:rStyle w:val="VerbatimChar"/>
+              </w:rPr>
               <w:t xml:space="preserve">test_nao_empresta_quarto_livro</w:t>
             </w:r>
           </w:p>
@@ -5207,7 +5360,7 @@
         <w:pStyle w:val="FirstParagraph"/>
       </w:pPr>
       <w:r>
-        <w:t xml:space="preserve">Os defeitos foram inseridos em uma cópia do código (o repositório continua correto) e os 17 testes foram executados contra cada cópia.</w:t>
+        <w:t xml:space="preserve">Os defeitos foram inseridos em uma cópia do código (o repositório continua correto) e os 18 testes foram executados contra cada cópia.</w:t>
       </w:r>
     </w:p>
     <w:p>
@@ -5385,7 +5538,7 @@
         <w:t xml:space="preserve"> </w:t>
       </w:r>
       <w:r>
-        <w:t xml:space="preserve">(1 reprovado, 16 aprovados).</w:t>
+        <w:t xml:space="preserve">(1 reprovado, 17 aprovados).</w:t>
       </w:r>
     </w:p>
     <w:p>
@@ -5574,7 +5727,7 @@
         <w:t xml:space="preserve">Actual: avisar('ana', 4)</w:t>
       </w:r>
       <w:r>
-        <w:t xml:space="preserve">). Ao todo, 5 testes reprovaram (os valores 8, 31 e 32 dias, o de 3 dias e o de notificação) e 12 aprovaram.</w:t>
+        <w:t xml:space="preserve">). Ao todo, 5 testes reprovaram (os valores 8, 31 e 32 dias, o de 3 dias e o de notificação) e 13 aprovaram.</w:t>
       </w:r>
     </w:p>
     <w:p>
@@ -5620,7 +5773,7 @@
         <w:pStyle w:val="FirstParagraph"/>
       </w:pPr>
       <w:r>
-        <w:t xml:space="preserve">Ambos os defeitos foram detectados pelos testes, o que mostra o valor dos valores-limite e da regressão automatizada. O código do repositório continua passando em 17/17.</w:t>
+        <w:t xml:space="preserve">Ambos os defeitos foram detectados pelos testes, o que mostra o valor dos valores-limite e da regressão automatizada. O código do repositório continua passando em 18/18.</w:t>
       </w:r>
     </w:p>
     <w:bookmarkEnd w:id="23"/>
@@ -5948,7 +6101,7 @@
         </w:numPr>
       </w:pPr>
       <w:r>
-        <w:t xml:space="preserve">Todas as 6 regras de negócio ficaram cobertas, com 17 testes aprovados e 100% de cobertura de linhas e branches.</w:t>
+        <w:t xml:space="preserve">Todas as 6 regras de negócio ficaram cobertas, com 18 testes aprovados e 100% de cobertura de linhas e branches.</w:t>
       </w:r>
     </w:p>
     <w:p>

</xml_diff>

<commit_message>
docs: adiciona capa, sumario e referencias ao relatorio
</commit_message>
<xml_diff>
--- a/relatorio.docx
+++ b/relatorio.docx
@@ -23,7 +23,7 @@
         <w:pStyle w:val="Author"/>
       </w:pPr>
       <w:r>
-        <w:t xml:space="preserve">Aluno: Matheus Vitor — Bacharelado em Ciências da Computação</w:t>
+        <w:t xml:space="preserve">Matheus Vitor — Bacharelado em Ciências da Computação</w:t>
       </w:r>
     </w:p>
     <w:p>
@@ -31,7 +31,38 @@
         <w:pStyle w:val="Date"/>
       </w:pPr>
       <w:r>
-        <w:t xml:space="preserve">Prof. Gerson Peres — Entrega: 08/10/2026</w:t>
+        <w:t xml:space="preserve">Disciplina: Testes de Software · Prof. Gerson Peres · Entrega: 08/10/2026</w:t>
+      </w:r>
+    </w:p>
+    <w:sdt>
+      <w:sdtPr>
+        <w:docPartObj>
+          <w:docPartGallery w:val="Table of Contents"/>
+          <w:docPartUnique/>
+        </w:docPartObj>
+      </w:sdtPr>
+      <w:sdtContent>
+        <w:p>
+          <w:pPr>
+            <w:pStyle w:val="TOCHeading"/>
+          </w:pPr>
+          <w:r>
+            <w:t xml:space="preserve">Sumário</w:t>
+          </w:r>
+        </w:p>
+        <w:p>
+          <w:r>
+            <w:fldChar w:fldCharType="begin" w:dirty="true"/>
+            <w:instrText xml:space="preserve">TOC \o "1-3" \h \z \u</w:instrText>
+            <w:fldChar w:fldCharType="separate"/>
+            <w:fldChar w:fldCharType="end"/>
+          </w:r>
+        </w:p>
+      </w:sdtContent>
+    </w:sdt>
+    <w:p>
+      <w:r>
+        <w:br w:type="page"/>
       </w:r>
     </w:p>
     <w:bookmarkStart w:id="9" w:name="cenário-e-regras-de-negócio"/>
@@ -374,7 +405,7 @@
         <w:pStyle w:val="FirstParagraph"/>
       </w:pPr>
       <w:r>
-        <w:t xml:space="preserve">Um erro gera um defeito, e o defeito só vira falha quando aquele trecho é executado com os dados certos.</w:t>
+        <w:t xml:space="preserve">Um erro gera um defeito, e o defeito só vira falha quando aquele trecho é executado com os dados certos (ISTQB, 2023).</w:t>
       </w:r>
     </w:p>
     <w:p>
@@ -1255,6 +1286,14 @@
     <w:p>
       <w:pPr>
         <w:pStyle w:val="FirstParagraph"/>
+      </w:pPr>
+      <w:r>
+        <w:t xml:space="preserve">As técnicas de partição de equivalência e de análise de valor limite seguem Myers, Sandler e Badgett (2011).</w:t>
+      </w:r>
+    </w:p>
+    <w:p>
+      <w:pPr>
+        <w:pStyle w:val="BodyText"/>
       </w:pPr>
       <w:r>
         <w:rPr>
@@ -3667,7 +3706,7 @@
         <w:pStyle w:val="FirstParagraph"/>
       </w:pPr>
       <w:r>
-        <w:t xml:space="preserve">Cada etapa virou um commit no repositório git (</w:t>
+        <w:t xml:space="preserve">O ciclo Red-Green-Refactor segue a prática descrita por Beck (2002). Cada etapa virou um commit no repositório git (</w:t>
       </w:r>
       <w:r>
         <w:rPr>
@@ -6282,13 +6321,13 @@
     </w:p>
     <w:bookmarkEnd w:id="28"/>
     <w:bookmarkEnd w:id="29"/>
-    <w:bookmarkStart w:id="30" w:name="anexos"/>
+    <w:bookmarkStart w:id="30" w:name="referências"/>
     <w:p>
       <w:pPr>
         <w:pStyle w:val="Heading1"/>
       </w:pPr>
       <w:r>
-        <w:t xml:space="preserve">7. Anexos</w:t>
+        <w:t xml:space="preserve">7. Referências</w:t>
       </w:r>
     </w:p>
     <w:p>
@@ -6296,6 +6335,121 @@
         <w:pStyle w:val="FirstParagraph"/>
       </w:pPr>
       <w:r>
+        <w:t xml:space="preserve">BECK, Kent.</w:t>
+      </w:r>
+      <w:r>
+        <w:t xml:space="preserve"> </w:t>
+      </w:r>
+      <w:r>
+        <w:rPr>
+          <w:b/>
+          <w:bCs/>
+        </w:rPr>
+        <w:t xml:space="preserve">Test-Driven Development: By Example</w:t>
+      </w:r>
+      <w:r>
+        <w:t xml:space="preserve">. Boston: Addison-Wesley, 2002.</w:t>
+      </w:r>
+    </w:p>
+    <w:p>
+      <w:pPr>
+        <w:pStyle w:val="BodyText"/>
+      </w:pPr>
+      <w:r>
+        <w:t xml:space="preserve">COVERAGE.PY.</w:t>
+      </w:r>
+      <w:r>
+        <w:t xml:space="preserve"> </w:t>
+      </w:r>
+      <w:r>
+        <w:rPr>
+          <w:b/>
+          <w:bCs/>
+        </w:rPr>
+        <w:t xml:space="preserve">Coverage.py documentation</w:t>
+      </w:r>
+      <w:r>
+        <w:t xml:space="preserve">. Disponível em: https://coverage.readthedocs.io. Acesso em: 7 out. 2026.</w:t>
+      </w:r>
+    </w:p>
+    <w:p>
+      <w:pPr>
+        <w:pStyle w:val="BodyText"/>
+      </w:pPr>
+      <w:r>
+        <w:t xml:space="preserve">INTERNATIONAL SOFTWARE TESTING QUALIFICATIONS BOARD (ISTQB).</w:t>
+      </w:r>
+      <w:r>
+        <w:t xml:space="preserve"> </w:t>
+      </w:r>
+      <w:r>
+        <w:rPr>
+          <w:b/>
+          <w:bCs/>
+        </w:rPr>
+        <w:t xml:space="preserve">Certified Tester Foundation Level Syllabus</w:t>
+      </w:r>
+      <w:r>
+        <w:t xml:space="preserve">, v4.0. 2023.</w:t>
+      </w:r>
+    </w:p>
+    <w:p>
+      <w:pPr>
+        <w:pStyle w:val="BodyText"/>
+      </w:pPr>
+      <w:r>
+        <w:t xml:space="preserve">MYERS, Glenford J.; SANDLER, Corey; BADGETT, Tom.</w:t>
+      </w:r>
+      <w:r>
+        <w:t xml:space="preserve"> </w:t>
+      </w:r>
+      <w:r>
+        <w:rPr>
+          <w:b/>
+          <w:bCs/>
+        </w:rPr>
+        <w:t xml:space="preserve">The Art of Software Testing</w:t>
+      </w:r>
+      <w:r>
+        <w:t xml:space="preserve">. 3. ed. Hoboken: John Wiley &amp; Sons, 2011.</w:t>
+      </w:r>
+    </w:p>
+    <w:p>
+      <w:pPr>
+        <w:pStyle w:val="BodyText"/>
+      </w:pPr>
+      <w:r>
+        <w:t xml:space="preserve">PYTEST.</w:t>
+      </w:r>
+      <w:r>
+        <w:t xml:space="preserve"> </w:t>
+      </w:r>
+      <w:r>
+        <w:rPr>
+          <w:b/>
+          <w:bCs/>
+        </w:rPr>
+        <w:t xml:space="preserve">pytest documentation</w:t>
+      </w:r>
+      <w:r>
+        <w:t xml:space="preserve">. Disponível em: https://docs.pytest.org. Acesso em: 7 out. 2026.</w:t>
+      </w:r>
+    </w:p>
+    <w:bookmarkEnd w:id="30"/>
+    <w:bookmarkStart w:id="31" w:name="anexos"/>
+    <w:p>
+      <w:pPr>
+        <w:pStyle w:val="Heading1"/>
+      </w:pPr>
+      <w:r>
+        <w:t xml:space="preserve">8. Anexos</w:t>
+      </w:r>
+    </w:p>
+    <w:p>
+      <w:pPr>
+        <w:pStyle w:val="FirstParagraph"/>
+      </w:pPr>
+      <w:r>
         <w:t xml:space="preserve">Repositório: https://github.com/MvitorLS/testes-software-biblioteca (branch</w:t>
       </w:r>
       <w:r>
@@ -6335,7 +6489,7 @@
         <w:t xml:space="preserve">, o histórico git dos ciclos TDD e este relatório.</w:t>
       </w:r>
     </w:p>
-    <w:bookmarkEnd w:id="30"/>
+    <w:bookmarkEnd w:id="31"/>
     <w:sectPr>
       <w:footnotePr>
         <w:numRestart w:val="eachSect"/>

</xml_diff>

<commit_message>
docs: detalha ciclos red-green-refactor no relatorio
</commit_message>
<xml_diff>
--- a/relatorio.docx
+++ b/relatorio.docx
@@ -3706,7 +3706,55 @@
         <w:pStyle w:val="FirstParagraph"/>
       </w:pPr>
       <w:r>
-        <w:t xml:space="preserve">O ciclo Red-Green-Refactor segue a prática descrita por Beck (2002). Cada etapa virou um commit no repositório git (</w:t>
+        <w:t xml:space="preserve">O ciclo Red-Green-Refactor segue a prática descrita por Beck (2002) e tem três passos:</w:t>
+      </w:r>
+      <w:r>
+        <w:t xml:space="preserve"> </w:t>
+      </w:r>
+      <w:r>
+        <w:rPr>
+          <w:b/>
+          <w:bCs/>
+        </w:rPr>
+        <w:t xml:space="preserve">Red</w:t>
+      </w:r>
+      <w:r>
+        <w:t xml:space="preserve"> </w:t>
+      </w:r>
+      <w:r>
+        <w:t xml:space="preserve">(escrever um teste de uma regra e ver ele falhar, porque o código ainda não existe),</w:t>
+      </w:r>
+      <w:r>
+        <w:t xml:space="preserve"> </w:t>
+      </w:r>
+      <w:r>
+        <w:rPr>
+          <w:b/>
+          <w:bCs/>
+        </w:rPr>
+        <w:t xml:space="preserve">Green</w:t>
+      </w:r>
+      <w:r>
+        <w:t xml:space="preserve"> </w:t>
+      </w:r>
+      <w:r>
+        <w:t xml:space="preserve">(escrever o código mínimo para o teste passar) e</w:t>
+      </w:r>
+      <w:r>
+        <w:t xml:space="preserve"> </w:t>
+      </w:r>
+      <w:r>
+        <w:rPr>
+          <w:b/>
+          <w:bCs/>
+        </w:rPr>
+        <w:t xml:space="preserve">Refactor</w:t>
+      </w:r>
+      <w:r>
+        <w:t xml:space="preserve"> </w:t>
+      </w:r>
+      <w:r>
+        <w:t xml:space="preserve">(melhorar nomes e estrutura sem mudar o comportamento, mantendo os testes passando). Cada etapa virou um commit no repositório git (</w:t>
       </w:r>
       <w:r>
         <w:rPr>
@@ -3915,7 +3963,7 @@
               <w:pStyle w:val="Compact"/>
             </w:pPr>
             <w:r>
-              <w:t xml:space="preserve">1</w:t>
+              <w:t xml:space="preserve">1 (RN1, RN2)</w:t>
             </w:r>
           </w:p>
         </w:tc>
@@ -4015,7 +4063,7 @@
               <w:pStyle w:val="Compact"/>
             </w:pPr>
             <w:r>
-              <w:t xml:space="preserve">2</w:t>
+              <w:t xml:space="preserve">2 (RN3)</w:t>
             </w:r>
           </w:p>
         </w:tc>
@@ -4079,7 +4127,7 @@
               <w:pStyle w:val="Compact"/>
             </w:pPr>
             <w:r>
-              <w:t xml:space="preserve">3</w:t>
+              <w:t xml:space="preserve">3 (RN4, RN5, RN6)</w:t>
             </w:r>
           </w:p>
         </w:tc>
@@ -4209,7 +4257,7 @@
               <w:pStyle w:val="Compact"/>
             </w:pPr>
             <w:r>
-              <w:t xml:space="preserve">4</w:t>
+              <w:t xml:space="preserve">4 (RN5, notificação)</w:t>
             </w:r>
           </w:p>
         </w:tc>

</xml_diff>